<commit_message>
Add init_db.py and update test guide for Phase 1 completeness
- scripts/init_db.py: creates dataset_images table in Supabase (IF NOT
  EXISTS) and optionally populates it from a local image folder with
  train/val/test split assignment. Idempotent via ON CONFLICT DO NOTHING.
- scripts/generate_guide_test.py: add init_db.py one-shot step, add
  test_connections.py section (Supabase+DagsHub), renumber tests 1-5,
  use generic paths (~/... and $env:USERPROFILE\... instead of hardcoded)
- reports/Guide_Test_Phase1.docx: regenerated

Co-Authored-By: Claude Sonnet 4.6 <noreply@anthropic.com>
</commit_message>
<xml_diff>
--- a/reports/Guide_Test_Phase1.docx
+++ b/reports/Guide_Test_Phase1.docx
@@ -68,7 +68,229 @@
         <w:pStyle w:val="Heading2"/>
       </w:pPr>
       <w:r>
-        <w:t>Test 1 — Connexion DagsHub</w:t>
+        <w:t>Étape préalable — Initialisation Supabase (one-shot)</w:t>
+      </w:r>
+    </w:p>
+    <w:p>
+      <w:r>
+        <w:rPr>
+          <w:i/>
+          <w:color w:val="C05000"/>
+          <w:sz w:val="18"/>
+        </w:rPr>
+        <w:t>⚠️  À lancer une seule fois avant tous les autres tests. Sans cette étape, test_connections.py échoue.</w:t>
+      </w:r>
+    </w:p>
+    <w:p>
+      <w:r>
+        <w:t>Cette commande crée la table dataset_images dans Supabase (la table predictions existe déjà). Idempotente : sans risque si relancée.</w:t>
+      </w:r>
+    </w:p>
+    <w:p>
+      <w:pPr>
+        <w:pStyle w:val="Heading3"/>
+      </w:pPr>
+      <w:r>
+        <w:t>Terminal Mac</w:t>
+      </w:r>
+    </w:p>
+    <w:p>
+      <w:pPr>
+        <w:ind w:left="283"/>
+        <w:shd w:val="clear" w:color="auto" w:fill="F0F0F0"/>
+      </w:pPr>
+      <w:r>
+        <w:rPr>
+          <w:rFonts w:ascii="Courier New" w:hAnsi="Courier New"/>
+          <w:color w:val="202020"/>
+          <w:sz w:val="17"/>
+        </w:rPr>
+        <w:t>cd ~/fev26_bmle_blood_cells</w:t>
+        <w:br/>
+        <w:t>source .venv/bin/activate</w:t>
+        <w:br/>
+        <w:t>python scripts/init_db.py</w:t>
+      </w:r>
+    </w:p>
+    <w:p>
+      <w:pPr>
+        <w:pStyle w:val="Heading3"/>
+      </w:pPr>
+      <w:r>
+        <w:t>Terminal Windows (PowerShell)</w:t>
+      </w:r>
+    </w:p>
+    <w:p>
+      <w:pPr>
+        <w:ind w:left="283"/>
+        <w:shd w:val="clear" w:color="auto" w:fill="F0F0F0"/>
+      </w:pPr>
+      <w:r>
+        <w:rPr>
+          <w:rFonts w:ascii="Courier New" w:hAnsi="Courier New"/>
+          <w:color w:val="202020"/>
+          <w:sz w:val="17"/>
+        </w:rPr>
+        <w:t>cd "$env:USERPROFILE\fev26_bmle_blood_cells"</w:t>
+        <w:br/>
+        <w:t>.venv\Scripts\Activate.ps1</w:t>
+        <w:br/>
+        <w:t>python scripts/init_db.py</w:t>
+      </w:r>
+    </w:p>
+    <w:p>
+      <w:r>
+        <w:rPr>
+          <w:b/>
+        </w:rPr>
+        <w:t>Résultat attendu :</w:t>
+      </w:r>
+    </w:p>
+    <w:p>
+      <w:pPr>
+        <w:ind w:left="283"/>
+        <w:shd w:val="clear" w:color="auto" w:fill="F0F0F0"/>
+      </w:pPr>
+      <w:r>
+        <w:rPr>
+          <w:rFonts w:ascii="Courier New" w:hAnsi="Courier New"/>
+          <w:color w:val="202020"/>
+          <w:sz w:val="17"/>
+        </w:rPr>
+        <w:t>Connexion à Supabase...</w:t>
+        <w:br/>
+        <w:t xml:space="preserve">  [OK] Connexion établie</w:t>
+        <w:br/>
+        <w:br/>
+        <w:t>Création des tables...</w:t>
+        <w:br/>
+        <w:t xml:space="preserve">  [OK] Tables 'predictions' et 'dataset_images' créées (ou déjà existantes)</w:t>
+        <w:br/>
+        <w:br/>
+        <w:t>Terminé.</w:t>
+      </w:r>
+    </w:p>
+    <w:p>
+      <w:pPr>
+        <w:pStyle w:val="Heading2"/>
+      </w:pPr>
+      <w:r>
+        <w:t>Test 1 — Connexions infrastructure (Supabase + DagsHub)</w:t>
+      </w:r>
+    </w:p>
+    <w:p>
+      <w:r>
+        <w:rPr>
+          <w:i/>
+          <w:color w:val="1F497D"/>
+          <w:sz w:val="18"/>
+        </w:rPr>
+        <w:t>ℹ️  Ce test vérifie les deux connexions infrastructure en une seule commande.</w:t>
+      </w:r>
+    </w:p>
+    <w:p>
+      <w:pPr>
+        <w:pStyle w:val="Heading3"/>
+      </w:pPr>
+      <w:r>
+        <w:t>Terminal Mac</w:t>
+      </w:r>
+    </w:p>
+    <w:p>
+      <w:pPr>
+        <w:ind w:left="283"/>
+        <w:shd w:val="clear" w:color="auto" w:fill="F0F0F0"/>
+      </w:pPr>
+      <w:r>
+        <w:rPr>
+          <w:rFonts w:ascii="Courier New" w:hAnsi="Courier New"/>
+          <w:color w:val="202020"/>
+          <w:sz w:val="17"/>
+        </w:rPr>
+        <w:t>python scripts/test_connections.py</w:t>
+      </w:r>
+    </w:p>
+    <w:p>
+      <w:pPr>
+        <w:pStyle w:val="Heading3"/>
+      </w:pPr>
+      <w:r>
+        <w:t>Terminal Windows (PowerShell)</w:t>
+      </w:r>
+    </w:p>
+    <w:p>
+      <w:pPr>
+        <w:ind w:left="283"/>
+        <w:shd w:val="clear" w:color="auto" w:fill="F0F0F0"/>
+      </w:pPr>
+      <w:r>
+        <w:rPr>
+          <w:rFonts w:ascii="Courier New" w:hAnsi="Courier New"/>
+          <w:color w:val="202020"/>
+          <w:sz w:val="17"/>
+        </w:rPr>
+        <w:t>python scripts/test_connections.py</w:t>
+      </w:r>
+    </w:p>
+    <w:p>
+      <w:r>
+        <w:rPr>
+          <w:b/>
+        </w:rPr>
+        <w:t>Résultat attendu :</w:t>
+      </w:r>
+    </w:p>
+    <w:p>
+      <w:pPr>
+        <w:ind w:left="283"/>
+        <w:shd w:val="clear" w:color="auto" w:fill="F0F0F0"/>
+      </w:pPr>
+      <w:r>
+        <w:rPr>
+          <w:rFonts w:ascii="Courier New" w:hAnsi="Courier New"/>
+          <w:color w:val="202020"/>
+          <w:sz w:val="17"/>
+        </w:rPr>
+        <w:t>==================================================</w:t>
+        <w:br/>
+        <w:t xml:space="preserve">  Test des connexions infrastructure</w:t>
+        <w:br/>
+        <w:t>==================================================</w:t>
+        <w:br/>
+        <w:br/>
+        <w:t>[1/2] Supabase (PostgreSQL)</w:t>
+        <w:br/>
+        <w:t xml:space="preserve">  [OK] Connexion établie</w:t>
+        <w:br/>
+        <w:t xml:space="preserve">  [OK] Insertion OK (id=...)</w:t>
+        <w:br/>
+        <w:t xml:space="preserve">  [OK] Lecture OK → ('test_connection.jpg', 'neutrophil', 0.99)</w:t>
+        <w:br/>
+        <w:t xml:space="preserve">  [OK] Nettoyage de la ligne de test OK</w:t>
+        <w:br/>
+        <w:br/>
+        <w:t>[2/2] DagsHub (datalake images + modèles)</w:t>
+        <w:br/>
+        <w:t xml:space="preserve">  [OK] Manifest Models.dvc OK (md5=xxxxxxxx...)</w:t>
+        <w:br/>
+        <w:t xml:space="preserve">  [OK] Manifest Source_100.dvc OK (md5=xxxxxxxx...)</w:t>
+        <w:br/>
+        <w:br/>
+        <w:t>==================================================</w:t>
+        <w:br/>
+        <w:t xml:space="preserve">  Supabase     OK</w:t>
+        <w:br/>
+        <w:t xml:space="preserve">  DagsHub      OK</w:t>
+        <w:br/>
+        <w:t>==================================================</w:t>
+      </w:r>
+    </w:p>
+    <w:p>
+      <w:pPr>
+        <w:pStyle w:val="Heading2"/>
+      </w:pPr>
+      <w:r>
+        <w:t>Test 2 — Connexion DagsHub (téléchargement)</w:t>
       </w:r>
     </w:p>
     <w:p>
@@ -146,7 +368,7 @@
         <w:pStyle w:val="Heading2"/>
       </w:pPr>
       <w:r>
-        <w:t>Test 2 — Entraînement (training.py sans API)</w:t>
+        <w:t>Test 3 — Entraînement (training.py sans API)</w:t>
       </w:r>
     </w:p>
     <w:p>
@@ -255,7 +477,7 @@
           <w:color w:val="202020"/>
           <w:sz w:val="17"/>
         </w:rPr>
-        <w:t>cd /chemin/vers/fev26_bmle_blood_cells</w:t>
+        <w:t>cd ~/fev26_bmle_blood_cells</w:t>
         <w:br/>
         <w:t>source .venv/bin/activate</w:t>
         <w:br/>
@@ -285,7 +507,7 @@
           <w:color w:val="202020"/>
           <w:sz w:val="17"/>
         </w:rPr>
-        <w:t>cd C:\Users\&lt;votre-nom&gt;\fev26_bmle_blood_cells</w:t>
+        <w:t>cd "$env:USERPROFILE\fev26_bmle_blood_cells"</w:t>
         <w:br/>
         <w:t>.venv\Scripts\Activate.ps1</w:t>
         <w:br/>
@@ -301,7 +523,7 @@
         <w:pStyle w:val="Heading2"/>
       </w:pPr>
       <w:r>
-        <w:t>Test 3 — Prédiction (predict_model.py sans API)</w:t>
+        <w:t>Test 4 — Prédiction (predict_model.py sans API)</w:t>
       </w:r>
     </w:p>
     <w:p>
@@ -438,7 +660,7 @@
         <w:pStyle w:val="Heading2"/>
       </w:pPr>
       <w:r>
-        <w:t>Test 4 — API FastAPI complète</w:t>
+        <w:t>Test 5 — API FastAPI complète</w:t>
       </w:r>
     </w:p>
     <w:p>
@@ -858,7 +1080,7 @@
               <w:rPr>
                 <w:sz w:val="18"/>
               </w:rPr>
-              <w:t>DagsHub</w:t>
+              <w:t>init_db.py</w:t>
             </w:r>
           </w:p>
         </w:tc>
@@ -878,7 +1100,7 @@
               <w:rPr>
                 <w:sz w:val="18"/>
               </w:rPr>
-              <w:t>"Test DagsHub connection"</w:t>
+              <w:t>python scripts/init_db.py</w:t>
             </w:r>
           </w:p>
         </w:tc>
@@ -899,7 +1121,133 @@
                 <w:color w:val="007000"/>
                 <w:sz w:val="18"/>
               </w:rPr>
-              <w:t>Connexion DagsHub OK</w:t>
+              <w:t>Tables 'predictions' et 'dataset_images' créées (ou déjà existantes)</w:t>
+            </w:r>
+          </w:p>
+        </w:tc>
+      </w:tr>
+      <w:tr>
+        <w:tc>
+          <w:tcPr>
+            <w:tcW w:type="dxa" w:w="2880"/>
+            <w:shd w:val="clear" w:color="auto" w:fill="FFFFFF"/>
+            <w:tcBorders>
+              <w:top w:val="single" w:sz="4" w:color="AAAAAA"/>
+              <w:left w:val="single" w:sz="4" w:color="AAAAAA"/>
+              <w:bottom w:val="single" w:sz="4" w:color="AAAAAA"/>
+              <w:right w:val="single" w:sz="4" w:color="AAAAAA"/>
+            </w:tcBorders>
+          </w:tcPr>
+          <w:p>
+            <w:r>
+              <w:rPr>
+                <w:sz w:val="18"/>
+              </w:rPr>
+              <w:t>Connexions</w:t>
+            </w:r>
+          </w:p>
+        </w:tc>
+        <w:tc>
+          <w:tcPr>
+            <w:tcW w:type="dxa" w:w="2880"/>
+            <w:shd w:val="clear" w:color="auto" w:fill="FFFFFF"/>
+            <w:tcBorders>
+              <w:top w:val="single" w:sz="4" w:color="AAAAAA"/>
+              <w:left w:val="single" w:sz="4" w:color="AAAAAA"/>
+              <w:bottom w:val="single" w:sz="4" w:color="AAAAAA"/>
+              <w:right w:val="single" w:sz="4" w:color="AAAAAA"/>
+            </w:tcBorders>
+          </w:tcPr>
+          <w:p>
+            <w:r>
+              <w:rPr>
+                <w:sz w:val="18"/>
+              </w:rPr>
+              <w:t>python scripts/test_connections.py</w:t>
+            </w:r>
+          </w:p>
+        </w:tc>
+        <w:tc>
+          <w:tcPr>
+            <w:tcW w:type="dxa" w:w="2880"/>
+            <w:shd w:val="clear" w:color="auto" w:fill="FFFFFF"/>
+            <w:tcBorders>
+              <w:top w:val="single" w:sz="4" w:color="AAAAAA"/>
+              <w:left w:val="single" w:sz="4" w:color="AAAAAA"/>
+              <w:bottom w:val="single" w:sz="4" w:color="AAAAAA"/>
+              <w:right w:val="single" w:sz="4" w:color="AAAAAA"/>
+            </w:tcBorders>
+          </w:tcPr>
+          <w:p>
+            <w:r>
+              <w:rPr>
+                <w:color w:val="007000"/>
+                <w:sz w:val="18"/>
+              </w:rPr>
+              <w:t>Supabase OK + DagsHub OK</w:t>
+            </w:r>
+          </w:p>
+        </w:tc>
+      </w:tr>
+      <w:tr>
+        <w:tc>
+          <w:tcPr>
+            <w:tcW w:type="dxa" w:w="2880"/>
+            <w:shd w:val="clear" w:color="auto" w:fill="EBF3FB"/>
+            <w:tcBorders>
+              <w:top w:val="single" w:sz="4" w:color="AAAAAA"/>
+              <w:left w:val="single" w:sz="4" w:color="AAAAAA"/>
+              <w:bottom w:val="single" w:sz="4" w:color="AAAAAA"/>
+              <w:right w:val="single" w:sz="4" w:color="AAAAAA"/>
+            </w:tcBorders>
+          </w:tcPr>
+          <w:p>
+            <w:r>
+              <w:rPr>
+                <w:sz w:val="18"/>
+              </w:rPr>
+              <w:t>DagsHub DL</w:t>
+            </w:r>
+          </w:p>
+        </w:tc>
+        <w:tc>
+          <w:tcPr>
+            <w:tcW w:type="dxa" w:w="2880"/>
+            <w:shd w:val="clear" w:color="auto" w:fill="EBF3FB"/>
+            <w:tcBorders>
+              <w:top w:val="single" w:sz="4" w:color="AAAAAA"/>
+              <w:left w:val="single" w:sz="4" w:color="AAAAAA"/>
+              <w:bottom w:val="single" w:sz="4" w:color="AAAAAA"/>
+              <w:right w:val="single" w:sz="4" w:color="AAAAAA"/>
+            </w:tcBorders>
+          </w:tcPr>
+          <w:p>
+            <w:r>
+              <w:rPr>
+                <w:sz w:val="18"/>
+              </w:rPr>
+              <w:t>"Test DagsHub connection" (VSCode)</w:t>
+            </w:r>
+          </w:p>
+        </w:tc>
+        <w:tc>
+          <w:tcPr>
+            <w:tcW w:type="dxa" w:w="2880"/>
+            <w:shd w:val="clear" w:color="auto" w:fill="EBF3FB"/>
+            <w:tcBorders>
+              <w:top w:val="single" w:sz="4" w:color="AAAAAA"/>
+              <w:left w:val="single" w:sz="4" w:color="AAAAAA"/>
+              <w:bottom w:val="single" w:sz="4" w:color="AAAAAA"/>
+              <w:right w:val="single" w:sz="4" w:color="AAAAAA"/>
+            </w:tcBorders>
+          </w:tcPr>
+          <w:p>
+            <w:r>
+              <w:rPr>
+                <w:color w:val="007000"/>
+                <w:sz w:val="18"/>
+              </w:rPr>
+              <w:t>Connexion DagsHub OK + modèle présent</w:t>
             </w:r>
           </w:p>
         </w:tc>

</xml_diff>

<commit_message>
Update guide: mark Supabase init as already done (tables exist since 2026-06-16)
</commit_message>
<xml_diff>
--- a/reports/Guide_Test_Phase1.docx
+++ b/reports/Guide_Test_Phase1.docx
@@ -68,22 +68,22 @@
         <w:pStyle w:val="Heading2"/>
       </w:pPr>
       <w:r>
-        <w:t>Étape préalable — Initialisation Supabase (one-shot)</w:t>
+        <w:t>Étape préalable — Initialisation Supabase (déjà fait ✅)</w:t>
       </w:r>
     </w:p>
     <w:p>
       <w:r>
         <w:rPr>
           <w:i/>
-          <w:color w:val="C05000"/>
+          <w:color w:val="1F497D"/>
           <w:sz w:val="18"/>
         </w:rPr>
-        <w:t>⚠️  À lancer une seule fois avant tous les autres tests. Sans cette étape, test_connections.py échoue.</w:t>
+        <w:t>ℹ️  Cette étape a déjà été réalisée le 16 juin 2026. Les tables 'predictions' et 'dataset_images' existent dans Supabase. Ne pas relancer sauf en cas de recréation complète de la base.</w:t>
       </w:r>
     </w:p>
     <w:p>
       <w:r>
-        <w:t>Cette commande crée la table dataset_images dans Supabase (la table predictions existe déjà). Idempotente : sans risque si relancée.</w:t>
+        <w:t>Pour mémoire, la commande était :</w:t>
       </w:r>
     </w:p>
     <w:p>

</xml_diff>

<commit_message>
Fix test_connections.py and update Phase 1 test guide
test_connections.py:
- Use DAGSHUB_REPO_OWNER for base URL instead of DAGSHUB_USER (fixes 404)
- Add verify=False + urllib3 warning suppression for SSL on Windows
- Replace Unicode arrows with ASCII to avoid Windows charmap errors

Guide_Test_Phase1:
- Add prerequisites: cd + venv activation before any other step
- Highlight SUPABASE_PASSWORD and DAGSHUB_TOKEN as key .env variables

Co-Authored-By: Claude Sonnet 4.6 <noreply@anthropic.com>
</commit_message>
<xml_diff>
--- a/reports/Guide_Test_Phase1.docx
+++ b/reports/Guide_Test_Phase1.docx
@@ -42,7 +42,80 @@
     </w:p>
     <w:p>
       <w:r>
-        <w:t xml:space="preserve">Avoir un fichier </w:t>
+        <w:rPr>
+          <w:b/>
+        </w:rPr>
+        <w:t>Prérequis 1 — Se placer dans le projet et activer l'environnement virtuel</w:t>
+      </w:r>
+    </w:p>
+    <w:p>
+      <w:pPr>
+        <w:pStyle w:val="Heading3"/>
+      </w:pPr>
+      <w:r>
+        <w:t>Mac</w:t>
+      </w:r>
+    </w:p>
+    <w:p>
+      <w:pPr>
+        <w:ind w:left="283"/>
+        <w:shd w:val="clear" w:color="auto" w:fill="F0F0F0"/>
+      </w:pPr>
+      <w:r>
+        <w:rPr>
+          <w:rFonts w:ascii="Courier New" w:hAnsi="Courier New"/>
+          <w:color w:val="202020"/>
+          <w:sz w:val="17"/>
+        </w:rPr>
+        <w:t>cd ~/fev26_bmle_blood_cells</w:t>
+        <w:br/>
+        <w:t>source .venv/bin/activate</w:t>
+      </w:r>
+    </w:p>
+    <w:p>
+      <w:pPr>
+        <w:pStyle w:val="Heading3"/>
+      </w:pPr>
+      <w:r>
+        <w:t>Windows (PowerShell)</w:t>
+      </w:r>
+    </w:p>
+    <w:p>
+      <w:pPr>
+        <w:ind w:left="283"/>
+        <w:shd w:val="clear" w:color="auto" w:fill="F0F0F0"/>
+      </w:pPr>
+      <w:r>
+        <w:rPr>
+          <w:rFonts w:ascii="Courier New" w:hAnsi="Courier New"/>
+          <w:color w:val="202020"/>
+          <w:sz w:val="17"/>
+        </w:rPr>
+        <w:t>cd "$env:USERPROFILE\fev26_bmle_blood_cells"</w:t>
+        <w:br/>
+        <w:t>.venv\Scripts\Activate.ps1</w:t>
+      </w:r>
+    </w:p>
+    <w:p>
+      <w:r>
+        <w:rPr>
+          <w:b/>
+        </w:rPr>
+        <w:t>Prérequis 2 — Fichier .env configuré</w:t>
+      </w:r>
+    </w:p>
+    <w:p>
+      <w:r>
+        <w:t xml:space="preserve">Copier </w:t>
+      </w:r>
+      <w:r>
+        <w:rPr>
+          <w:rFonts w:ascii="Courier New" w:hAnsi="Courier New"/>
+        </w:rPr>
+        <w:t>.env.example</w:t>
+      </w:r>
+      <w:r>
+        <w:t xml:space="preserve"> en </w:t>
       </w:r>
       <w:r>
         <w:rPr>
@@ -51,16 +124,27 @@
         <w:t>.env</w:t>
       </w:r>
       <w:r>
-        <w:t xml:space="preserve"> à la racine du projet (copier </w:t>
+        <w:t xml:space="preserve"> et remplir les valeurs — en particulier </w:t>
       </w:r>
       <w:r>
         <w:rPr>
           <w:rFonts w:ascii="Courier New" w:hAnsi="Courier New"/>
+          <w:b/>
         </w:rPr>
-        <w:t>.env.example</w:t>
+        <w:t>SUPABASE_PASSWORD</w:t>
       </w:r>
       <w:r>
-        <w:t xml:space="preserve"> et remplir les valeurs).</w:t>
+        <w:t xml:space="preserve"> et </w:t>
+      </w:r>
+      <w:r>
+        <w:rPr>
+          <w:rFonts w:ascii="Courier New" w:hAnsi="Courier New"/>
+          <w:b/>
+        </w:rPr>
+        <w:t>DAGSHUB_TOKEN</w:t>
+      </w:r>
+      <w:r>
+        <w:t>.</w:t>
       </w:r>
     </w:p>
     <w:p>

</xml_diff>